<commit_message>
Update combined conference paper.docx
</commit_message>
<xml_diff>
--- a/Draft/Conference Paper/combined conference paper.docx
+++ b/Draft/Conference Paper/combined conference paper.docx
@@ -27,6 +27,8 @@
           <w:sz w:val="18"/>
         </w:rPr>
       </w:pPr>
+      <w:proofErr w:type="spellStart"/>
+      <w:proofErr w:type="gramStart"/>
       <w:r>
         <w:rPr>
           <w:sz w:val="18"/>
@@ -34,6 +36,7 @@
         </w:rPr>
         <w:t>Ahuod</w:t>
       </w:r>
+      <w:proofErr w:type="spellEnd"/>
       <w:r>
         <w:rPr>
           <w:spacing w:val="-1"/>
@@ -47,6 +50,7 @@
         </w:rPr>
         <w:t>,</w:t>
       </w:r>
+      <w:proofErr w:type="gramEnd"/>
       <w:r>
         <w:rPr>
           <w:spacing w:val="-2"/>
@@ -54,43 +58,14 @@
         </w:rPr>
         <w:t xml:space="preserve"> </w:t>
       </w:r>
+      <w:proofErr w:type="gramStart"/>
       <w:r>
         <w:rPr>
           <w:sz w:val="18"/>
         </w:rPr>
-        <w:t>Ayesha</w:t>
-      </w:r>
-      <w:r>
-        <w:rPr>
-          <w:sz w:val="18"/>
-        </w:rPr>
-        <w:t>,</w:t>
-      </w:r>
-      <w:r>
-        <w:rPr>
-          <w:spacing w:val="-2"/>
-          <w:sz w:val="18"/>
-        </w:rPr>
-        <w:t xml:space="preserve"> </w:t>
-      </w:r>
-      <w:r>
-        <w:rPr>
-          <w:sz w:val="18"/>
-        </w:rPr>
-        <w:t>Kulsum</w:t>
-      </w:r>
-      <w:r>
-        <w:rPr>
-          <w:sz w:val="18"/>
-        </w:rPr>
-        <w:t>,</w:t>
-      </w:r>
-      <w:r>
-        <w:rPr>
-          <w:sz w:val="18"/>
-        </w:rPr>
-        <w:t>…</w:t>
-      </w:r>
+        <w:t>Kulsum,…</w:t>
+      </w:r>
+      <w:proofErr w:type="gramEnd"/>
       <w:r>
         <w:rPr>
           <w:spacing w:val="-4"/>
@@ -137,6 +112,7 @@
         </w:rPr>
         <w:t xml:space="preserve"> </w:t>
       </w:r>
+      <w:proofErr w:type="spellStart"/>
       <w:r>
         <w:rPr>
           <w:spacing w:val="-2"/>
@@ -144,6 +120,7 @@
         </w:rPr>
         <w:t>Jawarneh</w:t>
       </w:r>
+      <w:proofErr w:type="spellEnd"/>
     </w:p>
     <w:p>
       <w:pPr>
@@ -246,12 +223,30 @@
         </w:rPr>
         <w:t xml:space="preserve"> </w:t>
       </w:r>
+      <w:proofErr w:type="spellStart"/>
       <w:r>
         <w:rPr>
           <w:i/>
           <w:sz w:val="18"/>
         </w:rPr>
-        <w:t>P.O.Box.</w:t>
+        <w:t>P.</w:t>
+      </w:r>
+      <w:proofErr w:type="gramStart"/>
+      <w:r>
+        <w:rPr>
+          <w:i/>
+          <w:sz w:val="18"/>
+        </w:rPr>
+        <w:t>O.Box</w:t>
+      </w:r>
+      <w:proofErr w:type="spellEnd"/>
+      <w:proofErr w:type="gramEnd"/>
+      <w:r>
+        <w:rPr>
+          <w:i/>
+          <w:sz w:val="18"/>
+        </w:rPr>
+        <w:t>.</w:t>
       </w:r>
       <w:r>
         <w:rPr>
@@ -714,7 +709,23 @@
         <w:t xml:space="preserve"> </w:t>
       </w:r>
       <w:r>
-        <w:t>in the data generated daily, a large majority of which is spatial (a.k.a. geo-referenced or spatially-tagged). Certainly, the processing of these large amounts of data is incredibly taxing, more so when data joins are carried out as one of the most fundamental</w:t>
+        <w:t xml:space="preserve">in the data generated daily, a large majority of which is spatial (a.k.a. geo-referenced or </w:t>
+      </w:r>
+      <w:proofErr w:type="gramStart"/>
+      <w:r>
+        <w:t>spatially-tagged</w:t>
+      </w:r>
+      <w:proofErr w:type="gramEnd"/>
+      <w:r>
+        <w:t xml:space="preserve">). Certainly, the processing of these large amounts of data is incredibly taxing, more so when data </w:t>
+      </w:r>
+      <w:proofErr w:type="gramStart"/>
+      <w:r>
+        <w:t>joins</w:t>
+      </w:r>
+      <w:proofErr w:type="gramEnd"/>
+      <w:r>
+        <w:t xml:space="preserve"> are carried out as one of the most fundamental</w:t>
       </w:r>
       <w:r>
         <w:rPr>
@@ -840,8 +851,21 @@
         <w:t xml:space="preserve"> </w:t>
       </w:r>
       <w:r>
-        <w:t>applied in dynamic smart city application scenarios, specifically those that require fusing data from multiple georeferenced heterogeneous data streams. For example, authors in [1] have described a very interesting scenario where there is a need to merge hyperlocal air quality and mobility data of a city in an attempt to unleash possible autocorrelations between vehicles density and the air quality on a street-by-street level. Both mobility and air quality data are georeferenced, meaning that they are tagged with locational coordinates. This scenario requires an advanced geospatial join</w:t>
-      </w:r>
+        <w:t xml:space="preserve">applied in dynamic smart city application scenarios, specifically those that require fusing data from multiple georeferenced heterogeneous data streams. For example, authors in [1] have described a very interesting scenario where there is a need to merge hyperlocal air quality and mobility data of a city </w:t>
+      </w:r>
+      <w:proofErr w:type="gramStart"/>
+      <w:r>
+        <w:t>in an attempt to</w:t>
+      </w:r>
+      <w:proofErr w:type="gramEnd"/>
+      <w:r>
+        <w:t xml:space="preserve"> unleash possible autocorrelations between vehicles density and the air quality on a street-by-street level. Both mobility and air quality data are georeferenced, meaning that they are tagged with locational coordinates. This scenario requires an advanced geospatial </w:t>
+      </w:r>
+      <w:proofErr w:type="gramStart"/>
+      <w:r>
+        <w:t>join</w:t>
+      </w:r>
+      <w:proofErr w:type="gramEnd"/>
       <w:r>
         <w:rPr>
           <w:spacing w:val="-1"/>
@@ -884,9 +908,11 @@
         </w:rPr>
         <w:t xml:space="preserve"> </w:t>
       </w:r>
+      <w:proofErr w:type="gramStart"/>
       <w:r>
         <w:t>woks</w:t>
       </w:r>
+      <w:proofErr w:type="gramEnd"/>
       <w:r>
         <w:rPr>
           <w:spacing w:val="15"/>
@@ -1080,9 +1106,11 @@
         </w:rPr>
         <w:t xml:space="preserve"> </w:t>
       </w:r>
+      <w:proofErr w:type="gramStart"/>
       <w:r>
         <w:t>shapefile</w:t>
       </w:r>
+      <w:proofErr w:type="gramEnd"/>
       <w:r>
         <w:rPr>
           <w:spacing w:val="-13"/>
@@ -1108,7 +1136,15 @@
         <w:t xml:space="preserve"> </w:t>
       </w:r>
       <w:r>
-        <w:t>representing the administrative city districts. Those shapefiles are normally huge in size, which negatively affects the overall join performance, thus reducing their size is becoming indispensable.</w:t>
+        <w:t xml:space="preserve">representing the administrative city districts. Those shapefiles are normally huge in size, which negatively affects the overall join performance, thus reducing their </w:t>
+      </w:r>
+      <w:proofErr w:type="gramStart"/>
+      <w:r>
+        <w:t>size is</w:t>
+      </w:r>
+      <w:proofErr w:type="gramEnd"/>
+      <w:r>
+        <w:t xml:space="preserve"> becoming indispensable.</w:t>
       </w:r>
       <w:r>
         <w:rPr>
@@ -1189,7 +1225,39 @@
         <w:t xml:space="preserve"> </w:t>
       </w:r>
       <w:r>
-        <w:t>to reduce the geometric points in a geographical space (specially applied to vector line and polygon shapes), to reduce their storage size, whilst maintaining their general topology of the shape. Two of the most prominent line simplification algorithms are Douglas-Peucker [2] and Visvalingam-Whyatt [3]. This paper aims to explore the results of the line simplification algorithms when used alongside spatial joins, across two different implementation techniques (Shapely library</w:t>
+        <w:t>to reduce the geometric points in a geographical space (</w:t>
+      </w:r>
+      <w:proofErr w:type="gramStart"/>
+      <w:r>
+        <w:t>specially</w:t>
+      </w:r>
+      <w:proofErr w:type="gramEnd"/>
+      <w:r>
+        <w:t xml:space="preserve"> applied to vector line and polygon shapes), to reduce their storage size, whilst maintaining their general topology of the shape. Two of the most prominent line simplification algorithms are Douglas-</w:t>
+      </w:r>
+      <w:proofErr w:type="spellStart"/>
+      <w:r>
+        <w:t>Peucker</w:t>
+      </w:r>
+      <w:proofErr w:type="spellEnd"/>
+      <w:r>
+        <w:t xml:space="preserve"> [2] and </w:t>
+      </w:r>
+      <w:proofErr w:type="spellStart"/>
+      <w:r>
+        <w:t>Visvalingam</w:t>
+      </w:r>
+      <w:proofErr w:type="spellEnd"/>
+      <w:r>
+        <w:t xml:space="preserve">-Whyatt [3]. This paper aims to explore the results of the line simplification algorithms when used alongside spatial </w:t>
+      </w:r>
+      <w:proofErr w:type="gramStart"/>
+      <w:r>
+        <w:t>joins</w:t>
+      </w:r>
+      <w:proofErr w:type="gramEnd"/>
+      <w:r>
+        <w:t>, across two different implementation techniques (Shapely library</w:t>
       </w:r>
       <w:r>
         <w:rPr>
@@ -1252,7 +1320,15 @@
         <w:t xml:space="preserve"> </w:t>
       </w:r>
       <w:r>
-        <w:t>that ensures, to a significant extent that it does not negatively impact any analysis thereafter. The rest of the paper is organized as follows: Section II covers the related state-of-the-art works in the field; Section</w:t>
+        <w:t xml:space="preserve">that ensures, to a significant </w:t>
+      </w:r>
+      <w:proofErr w:type="gramStart"/>
+      <w:r>
+        <w:t>extent</w:t>
+      </w:r>
+      <w:proofErr w:type="gramEnd"/>
+      <w:r>
+        <w:t xml:space="preserve"> that it does not negatively impact any analysis thereafter. The rest of the paper is organized as follows: Section II covers the related state-of-the-art works in the field; Section</w:t>
       </w:r>
       <w:r>
         <w:rPr>
@@ -1349,7 +1425,23 @@
         <w:ind w:right="181" w:firstLine="288"/>
       </w:pPr>
       <w:r>
-        <w:t>Recently, authors in [5] proposed a polygon simplification method, named GeoRAP, built on geospatial approximate processing. Their framework is based on the Ramer-Douglas- Peucker line simplification algorithm to reduce the area coverage as well as a version of stratified spatial sampling to minimize</w:t>
+        <w:t xml:space="preserve">Recently, authors in [5] proposed a polygon simplification method, named </w:t>
+      </w:r>
+      <w:proofErr w:type="spellStart"/>
+      <w:r>
+        <w:t>GeoRAP</w:t>
+      </w:r>
+      <w:proofErr w:type="spellEnd"/>
+      <w:r>
+        <w:t xml:space="preserve">, built on geospatial approximate processing. Their framework is based on the Ramer-Douglas- </w:t>
+      </w:r>
+      <w:proofErr w:type="spellStart"/>
+      <w:r>
+        <w:t>Peucker</w:t>
+      </w:r>
+      <w:proofErr w:type="spellEnd"/>
+      <w:r>
+        <w:t xml:space="preserve"> line simplification algorithm to reduce the area coverage as well as a version of stratified spatial sampling to minimize</w:t>
       </w:r>
       <w:r>
         <w:rPr>
@@ -1430,7 +1522,15 @@
         <w:t xml:space="preserve"> </w:t>
       </w:r>
       <w:r>
-        <w:t xml:space="preserve">in each strata. This approach increases the throughput whilst </w:t>
+        <w:t xml:space="preserve">in each </w:t>
+      </w:r>
+      <w:proofErr w:type="gramStart"/>
+      <w:r>
+        <w:t>strata</w:t>
+      </w:r>
+      <w:proofErr w:type="gramEnd"/>
+      <w:r>
+        <w:t xml:space="preserve">. This approach increases the throughput whilst </w:t>
       </w:r>
       <w:r>
         <w:rPr>
@@ -1867,8 +1967,13 @@
         </w:rPr>
         <w:t xml:space="preserve">spatial-aware approximate query processing solution (termed as </w:t>
       </w:r>
-      <w:r>
-        <w:t>SpatialSSJP) that focuses on stream-static geospatial</w:t>
+      <w:proofErr w:type="spellStart"/>
+      <w:r>
+        <w:t>SpatialSSJP</w:t>
+      </w:r>
+      <w:proofErr w:type="spellEnd"/>
+      <w:r>
+        <w:t>) that focuses on stream-static geospatial</w:t>
       </w:r>
       <w:r>
         <w:rPr>
@@ -1886,7 +1991,15 @@
         <w:t xml:space="preserve"> </w:t>
       </w:r>
       <w:r>
-        <w:t xml:space="preserve">The paper proposes an efficient online sampling design to select a balanced and representative geospatial data from the stream using the Spark Structured Streaming framework [9], for a </w:t>
+        <w:t xml:space="preserve">The paper proposes an efficient online sampling design to select </w:t>
+      </w:r>
+      <w:proofErr w:type="gramStart"/>
+      <w:r>
+        <w:t>a balanced</w:t>
+      </w:r>
+      <w:proofErr w:type="gramEnd"/>
+      <w:r>
+        <w:t xml:space="preserve"> and representative geospatial data from the stream using the Spark Structured Streaming framework [9], for a </w:t>
       </w:r>
       <w:r>
         <w:rPr>
@@ -2078,8 +2191,13 @@
         </w:rPr>
         <w:t xml:space="preserve"> </w:t>
       </w:r>
-      <w:r>
-        <w:t>ApproxGeoViz,</w:t>
+      <w:proofErr w:type="spellStart"/>
+      <w:r>
+        <w:t>ApproxGeoViz</w:t>
+      </w:r>
+      <w:proofErr w:type="spellEnd"/>
+      <w:r>
+        <w:t>,</w:t>
       </w:r>
       <w:r>
         <w:rPr>
@@ -2117,11 +2235,19 @@
       <w:r>
         <w:t xml:space="preserve">geo-maps from fast arriving big georeferenced data streams can be generated. The model was tested on real smart city data and evaluated on time-based and accuracy-based QoS constraints. Correspondingly, [5] presented a similar methodology, </w:t>
       </w:r>
-      <w:r>
-        <w:rPr>
-          <w:spacing w:val="-2"/>
-        </w:rPr>
-        <w:t>ApproxGeoAgg,</w:t>
+      <w:proofErr w:type="spellStart"/>
+      <w:r>
+        <w:rPr>
+          <w:spacing w:val="-2"/>
+        </w:rPr>
+        <w:t>ApproxGeoAgg</w:t>
+      </w:r>
+      <w:proofErr w:type="spellEnd"/>
+      <w:r>
+        <w:rPr>
+          <w:spacing w:val="-2"/>
+        </w:rPr>
+        <w:t>,</w:t>
       </w:r>
       <w:r>
         <w:rPr>
@@ -2472,9 +2598,11 @@
         </w:rPr>
         <w:t xml:space="preserve"> </w:t>
       </w:r>
+      <w:proofErr w:type="gramStart"/>
       <w:r>
         <w:t>join</w:t>
       </w:r>
+      <w:proofErr w:type="gramEnd"/>
       <w:r>
         <w:rPr>
           <w:spacing w:val="-6"/>
@@ -2509,7 +2637,15 @@
         <w:t xml:space="preserve"> </w:t>
       </w:r>
       <w:r>
-        <w:t>be traced in the literature. Authors in [1] applied an filter-and-refinement approach</w:t>
+        <w:t xml:space="preserve">be traced in the literature. Authors in [1] applied </w:t>
+      </w:r>
+      <w:proofErr w:type="gramStart"/>
+      <w:r>
+        <w:t>an</w:t>
+      </w:r>
+      <w:proofErr w:type="gramEnd"/>
+      <w:r>
+        <w:t xml:space="preserve"> filter-and-refinement approach</w:t>
       </w:r>
       <w:r>
         <w:rPr>
@@ -2932,8 +3068,21 @@
         </w:rPr>
         <w:t xml:space="preserve"> </w:t>
       </w:r>
-      <w:r>
-        <w:t>Similarly authors [13] designed an Enhanced Douglas–Peucker (EDP) algorithm that employs a constellation of enhanced spatial– temporal constraints (ESTC) for simplifying and compressing trajectory data streams. Within the same consortium, [14] applied</w:t>
+      <w:proofErr w:type="gramStart"/>
+      <w:r>
+        <w:t>Similarly</w:t>
+      </w:r>
+      <w:proofErr w:type="gramEnd"/>
+      <w:r>
+        <w:t xml:space="preserve"> authors [13] designed an Enhanced Douglas–</w:t>
+      </w:r>
+      <w:proofErr w:type="spellStart"/>
+      <w:r>
+        <w:t>Peucker</w:t>
+      </w:r>
+      <w:proofErr w:type="spellEnd"/>
+      <w:r>
+        <w:t xml:space="preserve"> (EDP) algorithm that employs a constellation of enhanced spatial– temporal constraints (ESTC) for simplifying and compressing trajectory data streams. Within the same consortium, [14] applied</w:t>
       </w:r>
       <w:r>
         <w:rPr>
@@ -2968,6 +3117,7 @@
         </w:rPr>
         <w:t xml:space="preserve"> </w:t>
       </w:r>
+      <w:proofErr w:type="gramStart"/>
       <w:r>
         <w:t>algorithm</w:t>
       </w:r>
@@ -2980,6 +3130,7 @@
       <w:r>
         <w:t>based</w:t>
       </w:r>
+      <w:proofErr w:type="gramEnd"/>
       <w:r>
         <w:rPr>
           <w:spacing w:val="2"/>
@@ -3484,7 +3635,15 @@
         <w:t xml:space="preserve">that </w:t>
       </w:r>
       <w:r>
-        <w:t>references a geographical location, is dense by nature, having information of both the topic such as urban information, or air quality</w:t>
+        <w:t xml:space="preserve">references a geographical location, is dense by nature, having information of both the topic such as urban information, </w:t>
+      </w:r>
+      <w:proofErr w:type="gramStart"/>
+      <w:r>
+        <w:t>or</w:t>
+      </w:r>
+      <w:proofErr w:type="gramEnd"/>
+      <w:r>
+        <w:t xml:space="preserve"> air quality</w:t>
       </w:r>
       <w:r>
         <w:rPr>
@@ -3986,7 +4145,15 @@
         <w:t xml:space="preserve"> </w:t>
       </w:r>
       <w:r>
-        <w:t>representation of geospatial data. The effect this reduction has on a systems complexity is particularly evident in large datasets.</w:t>
+        <w:t xml:space="preserve">representation of geospatial data. The effect this reduction has on a </w:t>
+      </w:r>
+      <w:proofErr w:type="gramStart"/>
+      <w:r>
+        <w:t>systems</w:t>
+      </w:r>
+      <w:proofErr w:type="gramEnd"/>
+      <w:r>
+        <w:t xml:space="preserve"> complexity is particularly evident in large datasets.</w:t>
       </w:r>
     </w:p>
     <w:p>
@@ -4050,7 +4217,23 @@
         <w:t xml:space="preserve"> </w:t>
       </w:r>
       <w:r>
-        <w:t>joins, those are Douglas-Peucker (DP hereafter for short) and Visvalingam-Whyatt (VW hereafter for short) algorithms, which are discussed in the next two subsections.</w:t>
+        <w:t>joins, those are Douglas-</w:t>
+      </w:r>
+      <w:proofErr w:type="spellStart"/>
+      <w:r>
+        <w:t>Peucker</w:t>
+      </w:r>
+      <w:proofErr w:type="spellEnd"/>
+      <w:r>
+        <w:t xml:space="preserve"> (DP hereafter for short) and </w:t>
+      </w:r>
+      <w:proofErr w:type="spellStart"/>
+      <w:r>
+        <w:t>Visvalingam</w:t>
+      </w:r>
+      <w:proofErr w:type="spellEnd"/>
+      <w:r>
+        <w:t>-Whyatt (VW hereafter for short) algorithms, which are discussed in the next two subsections.</w:t>
       </w:r>
     </w:p>
     <w:p>
@@ -4070,13 +4253,23 @@
           <w:sz w:val="20"/>
         </w:rPr>
       </w:pPr>
+      <w:proofErr w:type="spellStart"/>
       <w:r>
         <w:rPr>
           <w:i/>
           <w:spacing w:val="-2"/>
           <w:sz w:val="20"/>
         </w:rPr>
-        <w:t>Visvalingam-Whyatt</w:t>
+        <w:t>Visvalingam</w:t>
+      </w:r>
+      <w:proofErr w:type="spellEnd"/>
+      <w:r>
+        <w:rPr>
+          <w:i/>
+          <w:spacing w:val="-2"/>
+          <w:sz w:val="20"/>
+        </w:rPr>
+        <w:t>-Whyatt</w:t>
       </w:r>
       <w:r>
         <w:rPr>
@@ -4100,8 +4293,13 @@
         <w:spacing w:before="61"/>
         <w:ind w:right="183"/>
       </w:pPr>
-      <w:r>
-        <w:t>Visvalingam-Whyatt (VW), introduced in 1993 [3], works by removing</w:t>
+      <w:proofErr w:type="spellStart"/>
+      <w:r>
+        <w:t>Visvalingam</w:t>
+      </w:r>
+      <w:proofErr w:type="spellEnd"/>
+      <w:r>
+        <w:t>-Whyatt (VW), introduced in 1993 [3], works by removing</w:t>
       </w:r>
       <w:r>
         <w:rPr>
@@ -4145,6 +4343,7 @@
         </w:rPr>
         <w:t xml:space="preserve"> </w:t>
       </w:r>
+      <w:proofErr w:type="gramStart"/>
       <w:r>
         <w:t>in</w:t>
       </w:r>
@@ -4166,6 +4365,7 @@
       <w:r>
         <w:t>given</w:t>
       </w:r>
+      <w:proofErr w:type="gramEnd"/>
       <w:r>
         <w:rPr>
           <w:spacing w:val="-12"/>
@@ -4297,8 +4497,17 @@
           <w:i/>
           <w:sz w:val="20"/>
         </w:rPr>
-        <w:t>Douglas-Peucker</w:t>
-      </w:r>
+        <w:t>Douglas-</w:t>
+      </w:r>
+      <w:proofErr w:type="spellStart"/>
+      <w:r>
+        <w:rPr>
+          <w:i/>
+          <w:sz w:val="20"/>
+        </w:rPr>
+        <w:t>Peucker</w:t>
+      </w:r>
+      <w:proofErr w:type="spellEnd"/>
       <w:r>
         <w:rPr>
           <w:spacing w:val="-10"/>
@@ -4385,7 +4594,15 @@
         <w:t xml:space="preserve"> </w:t>
       </w:r>
       <w:r>
-        <w:t xml:space="preserve">the Douglas-Peucker (DP) algorithm [2]. Preceding the VW </w:t>
+        <w:t>the Douglas-</w:t>
+      </w:r>
+      <w:proofErr w:type="spellStart"/>
+      <w:r>
+        <w:t>Peucker</w:t>
+      </w:r>
+      <w:proofErr w:type="spellEnd"/>
+      <w:r>
+        <w:t xml:space="preserve"> (DP) algorithm [2]. Preceding the VW </w:t>
       </w:r>
       <w:r>
         <w:rPr>
@@ -4828,16 +5045,60 @@
         <w:t xml:space="preserve"> </w:t>
       </w:r>
       <w:r>
-        <w:t xml:space="preserve">tolerance parameter that adjusts the degree of simplification, making it easy to scale the outcomes to varying levels of detail. Several vector line generalization algorithms are employed in the literature, which are categorized into five groups in [15]. For </w:t>
-      </w:r>
-      <w:r>
-        <w:rPr>
-          <w:spacing w:val="-2"/>
-        </w:rPr>
-        <w:t xml:space="preserve">example, Reumann–Witkam routine [16], the Douglas–Peucker </w:t>
-      </w:r>
-      <w:r>
-        <w:t xml:space="preserve">(DP) algorithm [2], and an algorithm by Visvalingam and Whyatt (VW) [3]. Global algorithms (e.g., DP) considers the </w:t>
+        <w:t xml:space="preserve">tolerance parameter that adjusts the degree of simplification, making it easy to scale the outcomes to varying levels of detail. Several vector line generalization algorithms are employed in </w:t>
+      </w:r>
+      <w:proofErr w:type="gramStart"/>
+      <w:r>
+        <w:t>the literature</w:t>
+      </w:r>
+      <w:proofErr w:type="gramEnd"/>
+      <w:r>
+        <w:t xml:space="preserve">, which are categorized into five groups in [15]. For </w:t>
+      </w:r>
+      <w:r>
+        <w:rPr>
+          <w:spacing w:val="-2"/>
+        </w:rPr>
+        <w:t>example, Reumann–</w:t>
+      </w:r>
+      <w:proofErr w:type="spellStart"/>
+      <w:r>
+        <w:rPr>
+          <w:spacing w:val="-2"/>
+        </w:rPr>
+        <w:t>Witkam</w:t>
+      </w:r>
+      <w:proofErr w:type="spellEnd"/>
+      <w:r>
+        <w:rPr>
+          <w:spacing w:val="-2"/>
+        </w:rPr>
+        <w:t xml:space="preserve"> routine [16], the Douglas–</w:t>
+      </w:r>
+      <w:proofErr w:type="spellStart"/>
+      <w:r>
+        <w:rPr>
+          <w:spacing w:val="-2"/>
+        </w:rPr>
+        <w:t>Peucker</w:t>
+      </w:r>
+      <w:proofErr w:type="spellEnd"/>
+      <w:r>
+        <w:rPr>
+          <w:spacing w:val="-2"/>
+        </w:rPr>
+        <w:t xml:space="preserve"> </w:t>
+      </w:r>
+      <w:r>
+        <w:t xml:space="preserve">(DP) algorithm [2], and an algorithm by </w:t>
+      </w:r>
+      <w:proofErr w:type="spellStart"/>
+      <w:r>
+        <w:t>Visvalingam</w:t>
+      </w:r>
+      <w:proofErr w:type="spellEnd"/>
+      <w:r>
+        <w:t xml:space="preserve"> and Whyatt (VW) [3]. Global algorithms (e.g., DP) considers the </w:t>
       </w:r>
       <w:r>
         <w:rPr>
@@ -4966,7 +5227,15 @@
         <w:t xml:space="preserve">categories </w:t>
       </w:r>
       <w:r>
-        <w:t>which work with segments of the entire line. DP and VW are preferred as they are more accurate for preserving the original line’s shape as corroborated in [15]. Having said that, we employ the DP and VW algorithms as integral parts of our system system in this paper.</w:t>
+        <w:t xml:space="preserve">which work with segments of the entire line. DP and VW are preferred as they are more accurate for preserving the original line’s shape as corroborated in [15]. Having said that, we employ the DP and VW algorithms as integral parts of our system </w:t>
+      </w:r>
+      <w:proofErr w:type="spellStart"/>
+      <w:r>
+        <w:t>system</w:t>
+      </w:r>
+      <w:proofErr w:type="spellEnd"/>
+      <w:r>
+        <w:t xml:space="preserve"> in this paper.</w:t>
       </w:r>
     </w:p>
     <w:p>
@@ -5092,7 +5361,15 @@
         <w:t xml:space="preserve">datasets were chosen. </w:t>
       </w:r>
       <w:r>
-        <w:t>The first dataset contains information about New York City Polygons, including the geographical boundaries for the neighborhoods across the city, where each neighborhood is represented by a polygon, a form of vector geospatial representation (in the form of GeoJSON file extension). The dataset has</w:t>
+        <w:t xml:space="preserve">The first dataset contains information about New York City Polygons, including the geographical boundaries for the neighborhoods across the city, where each neighborhood is represented by a polygon, a form of vector geospatial representation (in the form of </w:t>
+      </w:r>
+      <w:proofErr w:type="spellStart"/>
+      <w:r>
+        <w:t>GeoJSON</w:t>
+      </w:r>
+      <w:proofErr w:type="spellEnd"/>
+      <w:r>
+        <w:t xml:space="preserve"> file extension). The dataset has</w:t>
       </w:r>
       <w:r>
         <w:rPr>
@@ -5109,9 +5386,11 @@
         </w:rPr>
         <w:t xml:space="preserve"> </w:t>
       </w:r>
+      <w:proofErr w:type="spellStart"/>
       <w:r>
         <w:t>enteries</w:t>
       </w:r>
+      <w:proofErr w:type="spellEnd"/>
       <w:r>
         <w:rPr>
           <w:spacing w:val="-4"/>
@@ -5127,9 +5406,11 @@
         </w:rPr>
         <w:t xml:space="preserve"> </w:t>
       </w:r>
+      <w:proofErr w:type="gramStart"/>
       <w:r>
         <w:t>consisting</w:t>
       </w:r>
+      <w:proofErr w:type="gramEnd"/>
       <w:r>
         <w:rPr>
           <w:spacing w:val="-1"/>
@@ -5327,7 +5608,23 @@
         <w:t xml:space="preserve"> </w:t>
       </w:r>
       <w:r>
-        <w:t>cleaned, consistent, and suitable for further analysis and computations. The data that was gathered in CVS and GeoJSON formats including multiple attributes such as geographical boundaries (polygons and point geometries, longitude, and latitude) and environmental</w:t>
+        <w:t xml:space="preserve">cleaned, consistent, and suitable for further analysis and computations. The data that was gathered in CVS and </w:t>
+      </w:r>
+      <w:proofErr w:type="spellStart"/>
+      <w:r>
+        <w:t>GeoJSON</w:t>
+      </w:r>
+      <w:proofErr w:type="spellEnd"/>
+      <w:r>
+        <w:t xml:space="preserve"> formats </w:t>
+      </w:r>
+      <w:proofErr w:type="gramStart"/>
+      <w:r>
+        <w:t>including</w:t>
+      </w:r>
+      <w:proofErr w:type="gramEnd"/>
+      <w:r>
+        <w:t xml:space="preserve"> multiple attributes such as geographical boundaries (polygons and point geometries, longitude, and latitude) and environmental</w:t>
       </w:r>
       <w:r>
         <w:rPr>
@@ -6256,6 +6553,7 @@
         </w:rPr>
         <w:t xml:space="preserve"> </w:t>
       </w:r>
+      <w:proofErr w:type="gramStart"/>
       <w:r>
         <w:t>of</w:t>
       </w:r>
@@ -6268,12 +6566,14 @@
       <w:r>
         <w:t>particulate</w:t>
       </w:r>
+      <w:proofErr w:type="gramEnd"/>
       <w:r>
         <w:rPr>
           <w:spacing w:val="29"/>
         </w:rPr>
         <w:t xml:space="preserve">  </w:t>
       </w:r>
+      <w:proofErr w:type="gramStart"/>
       <w:r>
         <w:t>matters</w:t>
       </w:r>
@@ -6284,7 +6584,15 @@
         <w:t xml:space="preserve">  </w:t>
       </w:r>
       <w:r>
-        <w:t>(pm10</w:t>
+        <w:t>(</w:t>
+      </w:r>
+      <w:proofErr w:type="gramEnd"/>
+      <w:r>
+        <w:t>pm</w:t>
+      </w:r>
+      <w:proofErr w:type="gramStart"/>
+      <w:r>
+        <w:t>10</w:t>
       </w:r>
       <w:r>
         <w:rPr>
@@ -6295,6 +6603,7 @@
       <w:r>
         <w:t>and</w:t>
       </w:r>
+      <w:proofErr w:type="gramEnd"/>
       <w:r>
         <w:rPr>
           <w:spacing w:val="29"/>
@@ -6749,8 +7058,13 @@
         </w:rPr>
         <w:t xml:space="preserve"> </w:t>
       </w:r>
-      <w:r>
-        <w:t>GeoPython,</w:t>
+      <w:proofErr w:type="spellStart"/>
+      <w:r>
+        <w:t>GeoPython</w:t>
+      </w:r>
+      <w:proofErr w:type="spellEnd"/>
+      <w:r>
+        <w:t>,</w:t>
       </w:r>
       <w:r>
         <w:rPr>
@@ -6868,7 +7182,15 @@
         <w:ind w:right="180" w:firstLine="288"/>
       </w:pPr>
       <w:r>
-        <w:t xml:space="preserve">Douglas-Peucker with Shapely (hereafter DP-Shapely for </w:t>
+        <w:t>Douglas-</w:t>
+      </w:r>
+      <w:proofErr w:type="spellStart"/>
+      <w:r>
+        <w:t>Peucker</w:t>
+      </w:r>
+      <w:proofErr w:type="spellEnd"/>
+      <w:r>
+        <w:t xml:space="preserve"> with Shapely (hereafter DP-Shapely for </w:t>
       </w:r>
       <w:r>
         <w:rPr>
@@ -6975,12 +7297,14 @@
       <w:r>
         <w:t xml:space="preserve">a distance measure to test each single point by using the </w:t>
       </w:r>
+      <w:proofErr w:type="spellStart"/>
       <w:r>
         <w:rPr>
           <w:spacing w:val="-2"/>
         </w:rPr>
         <w:t>GeoPython</w:t>
       </w:r>
+      <w:proofErr w:type="spellEnd"/>
       <w:r>
         <w:rPr>
           <w:spacing w:val="-11"/>
@@ -7078,16 +7402,54 @@
         <w:t xml:space="preserve">As </w:t>
       </w:r>
       <w:r>
-        <w:t xml:space="preserve">mentioned in section II, the DP algorithm mainly reduces the number of vertices in each polygon while preserving the topology. The implementation of the function which iterates through each feature of the GeoJSON data, takes the polygon geometry as an input and applies the </w:t>
+        <w:t xml:space="preserve">mentioned in section II, the DP algorithm mainly reduces the number of vertices in each polygon while preserving the topology. The implementation of the function which iterates through each feature of the </w:t>
+      </w:r>
+      <w:proofErr w:type="spellStart"/>
+      <w:r>
+        <w:t>GeoJSON</w:t>
+      </w:r>
+      <w:proofErr w:type="spellEnd"/>
+      <w:r>
+        <w:t xml:space="preserve"> data, takes the polygon geometry as an input and applies the </w:t>
       </w:r>
       <w:r>
         <w:rPr>
           <w:rFonts w:ascii="Cambria Math" w:hAnsi="Cambria Math"/>
         </w:rPr>
-        <w:t>‘simplify()’</w:t>
-      </w:r>
-      <w:r>
-        <w:t xml:space="preserve"> method provided by the Shapely library, which takes a specified tolerance level as input; this determines how much of the geometry will be simplified. In general, they are indirectly proportional such that when the tolerance value increases, the number of vertices decrease. In order to maintain the original shape and minimize overlapping between the vertices, the tolerance was set to 0.001. As a result, a new dataset in the format</w:t>
+        <w:t>‘</w:t>
+      </w:r>
+      <w:proofErr w:type="gramStart"/>
+      <w:r>
+        <w:rPr>
+          <w:rFonts w:ascii="Cambria Math" w:hAnsi="Cambria Math"/>
+        </w:rPr>
+        <w:t>simplify(</w:t>
+      </w:r>
+      <w:proofErr w:type="gramEnd"/>
+      <w:r>
+        <w:rPr>
+          <w:rFonts w:ascii="Cambria Math" w:hAnsi="Cambria Math"/>
+        </w:rPr>
+        <w:t>)’</w:t>
+      </w:r>
+      <w:r>
+        <w:t xml:space="preserve"> method provided by the Shapely library, which takes a specified tolerance level as input; this determines how much of the geometry will be simplified. In general, they are indirectly proportional such that when the tolerance value increases, the number of vertices </w:t>
+      </w:r>
+      <w:proofErr w:type="gramStart"/>
+      <w:r>
+        <w:t>decrease</w:t>
+      </w:r>
+      <w:proofErr w:type="gramEnd"/>
+      <w:r>
+        <w:t xml:space="preserve">. </w:t>
+      </w:r>
+      <w:proofErr w:type="gramStart"/>
+      <w:r>
+        <w:t>In order to</w:t>
+      </w:r>
+      <w:proofErr w:type="gramEnd"/>
+      <w:r>
+        <w:t xml:space="preserve"> maintain the original shape and minimize overlapping between the vertices, the tolerance was set to 0.001. As a result, a new dataset in the format</w:t>
       </w:r>
       <w:r>
         <w:rPr>
@@ -7104,9 +7466,11 @@
         </w:rPr>
         <w:t xml:space="preserve"> </w:t>
       </w:r>
+      <w:proofErr w:type="spellStart"/>
       <w:r>
         <w:t>GeoJSON</w:t>
       </w:r>
+      <w:proofErr w:type="spellEnd"/>
       <w:r>
         <w:rPr>
           <w:spacing w:val="-13"/>
@@ -7178,7 +7542,15 @@
         <w:ind w:right="180" w:firstLine="288"/>
       </w:pPr>
       <w:r>
-        <w:t>Douglas-Peucker with Mapshaper.org [4]</w:t>
+        <w:t>Douglas-</w:t>
+      </w:r>
+      <w:proofErr w:type="spellStart"/>
+      <w:r>
+        <w:t>Peucker</w:t>
+      </w:r>
+      <w:proofErr w:type="spellEnd"/>
+      <w:r>
+        <w:t xml:space="preserve"> with Mapshaper.org [4]</w:t>
       </w:r>
       <w:r>
         <w:rPr>
@@ -7189,12 +7561,14 @@
       <w:r>
         <w:t xml:space="preserve">(hereafter DP- </w:t>
       </w:r>
+      <w:proofErr w:type="spellStart"/>
       <w:r>
         <w:rPr>
           <w:spacing w:val="-2"/>
         </w:rPr>
         <w:t>Mapshaper</w:t>
       </w:r>
+      <w:proofErr w:type="spellEnd"/>
       <w:r>
         <w:rPr>
           <w:spacing w:val="-7"/>
@@ -7342,8 +7716,13 @@
         </w:rPr>
         <w:t xml:space="preserve"> </w:t>
       </w:r>
-      <w:r>
-        <w:t>Mapshaper,</w:t>
+      <w:proofErr w:type="spellStart"/>
+      <w:r>
+        <w:t>Mapshaper</w:t>
+      </w:r>
+      <w:proofErr w:type="spellEnd"/>
+      <w:r>
+        <w:t>,</w:t>
       </w:r>
       <w:r>
         <w:rPr>
@@ -7388,7 +7767,15 @@
         <w:t xml:space="preserve"> </w:t>
       </w:r>
       <w:r>
-        <w:t>efficient map simplification. Mapshaper is</w:t>
+        <w:t xml:space="preserve">efficient map simplification. </w:t>
+      </w:r>
+      <w:proofErr w:type="spellStart"/>
+      <w:r>
+        <w:t>Mapshaper</w:t>
+      </w:r>
+      <w:proofErr w:type="spellEnd"/>
+      <w:r>
+        <w:t xml:space="preserve"> is</w:t>
       </w:r>
       <w:r>
         <w:rPr>
@@ -7441,9 +7828,11 @@
         </w:rPr>
         <w:t xml:space="preserve"> </w:t>
       </w:r>
+      <w:proofErr w:type="gramStart"/>
       <w:r>
         <w:t>mapmakers</w:t>
       </w:r>
+      <w:proofErr w:type="gramEnd"/>
       <w:r>
         <w:rPr>
           <w:spacing w:val="-9"/>
@@ -7603,9 +7992,11 @@
         </w:rPr>
         <w:t xml:space="preserve"> </w:t>
       </w:r>
+      <w:proofErr w:type="spellStart"/>
       <w:r>
         <w:t>Mapshaper</w:t>
       </w:r>
+      <w:proofErr w:type="spellEnd"/>
       <w:r>
         <w:rPr>
           <w:spacing w:val="-12"/>
@@ -7721,13 +8112,43 @@
         <w:t xml:space="preserve"> </w:t>
       </w:r>
       <w:r>
-        <w:t xml:space="preserve">data. The original GeoJSON file is fed into the Mapshaper and executes the </w:t>
+        <w:t xml:space="preserve">data. The original </w:t>
+      </w:r>
+      <w:proofErr w:type="spellStart"/>
+      <w:r>
+        <w:t>GeoJSON</w:t>
+      </w:r>
+      <w:proofErr w:type="spellEnd"/>
+      <w:r>
+        <w:t xml:space="preserve"> file is fed into the </w:t>
+      </w:r>
+      <w:proofErr w:type="spellStart"/>
+      <w:r>
+        <w:t>Mapshaper</w:t>
+      </w:r>
+      <w:proofErr w:type="spellEnd"/>
+      <w:r>
+        <w:t xml:space="preserve"> and executes the </w:t>
       </w:r>
       <w:r>
         <w:rPr>
           <w:rFonts w:ascii="Cambria Math" w:hAnsi="Cambria Math"/>
         </w:rPr>
-        <w:t>‘simplify()’</w:t>
+        <w:t>‘</w:t>
+      </w:r>
+      <w:proofErr w:type="gramStart"/>
+      <w:r>
+        <w:rPr>
+          <w:rFonts w:ascii="Cambria Math" w:hAnsi="Cambria Math"/>
+        </w:rPr>
+        <w:t>simplify(</w:t>
+      </w:r>
+      <w:proofErr w:type="gramEnd"/>
+      <w:r>
+        <w:rPr>
+          <w:rFonts w:ascii="Cambria Math" w:hAnsi="Cambria Math"/>
+        </w:rPr>
+        <w:t>)’</w:t>
       </w:r>
       <w:r>
         <w:t xml:space="preserve"> command with a specified tolerance, which</w:t>
@@ -8038,8 +8459,17 @@
           <w:spacing w:val="-2"/>
           <w:sz w:val="16"/>
         </w:rPr>
-        <w:t>DP-Mapshaper</w:t>
-      </w:r>
+        <w:t>DP-</w:t>
+      </w:r>
+      <w:proofErr w:type="spellStart"/>
+      <w:r>
+        <w:rPr>
+          <w:spacing w:val="-2"/>
+          <w:sz w:val="16"/>
+        </w:rPr>
+        <w:t>Mapshaper</w:t>
+      </w:r>
+      <w:proofErr w:type="spellEnd"/>
     </w:p>
     <w:p>
       <w:pPr>
@@ -9055,6 +9485,7 @@
         </w:rPr>
         <w:t xml:space="preserve"> </w:t>
       </w:r>
+      <w:proofErr w:type="gramStart"/>
       <w:r>
         <w:rPr>
           <w:rFonts w:ascii="Cambria Math" w:eastAsia="Cambria Math" w:hAnsi="Cambria Math"/>
@@ -9062,6 +9493,7 @@
         </w:rPr>
         <w:t>√(</w:t>
       </w:r>
+      <w:proofErr w:type="gramEnd"/>
       <w:r>
         <w:rPr>
           <w:i/>
@@ -9236,7 +9668,15 @@
         <w:ind w:right="38"/>
       </w:pPr>
       <w:r>
-        <w:t xml:space="preserve">the simplified data back into GeoJSON format for further </w:t>
+        <w:t xml:space="preserve">the simplified data back into </w:t>
+      </w:r>
+      <w:proofErr w:type="spellStart"/>
+      <w:r>
+        <w:t>GeoJSON</w:t>
+      </w:r>
+      <w:proofErr w:type="spellEnd"/>
+      <w:r>
+        <w:t xml:space="preserve"> format for further </w:t>
       </w:r>
       <w:r>
         <w:rPr>
@@ -9365,7 +9805,23 @@
         <w:t xml:space="preserve">VW </w:t>
       </w:r>
       <w:r>
-        <w:t xml:space="preserve">simplifier using the Mapshaper tool was examined. Similar to </w:t>
+        <w:t xml:space="preserve">simplifier using the </w:t>
+      </w:r>
+      <w:proofErr w:type="spellStart"/>
+      <w:r>
+        <w:t>Mapshaper</w:t>
+      </w:r>
+      <w:proofErr w:type="spellEnd"/>
+      <w:r>
+        <w:t xml:space="preserve"> tool was examined. </w:t>
+      </w:r>
+      <w:proofErr w:type="gramStart"/>
+      <w:r>
+        <w:t>Similar to</w:t>
+      </w:r>
+      <w:proofErr w:type="gramEnd"/>
+      <w:r>
+        <w:t xml:space="preserve"> </w:t>
       </w:r>
       <w:r>
         <w:rPr>
@@ -9479,8 +9935,13 @@
         <w:spacing w:before="111" w:line="228" w:lineRule="exact"/>
         <w:ind w:left="475"/>
       </w:pPr>
-      <w:r>
-        <w:t>Visvalingam-Whyatt</w:t>
+      <w:proofErr w:type="spellStart"/>
+      <w:r>
+        <w:t>Visvalingam</w:t>
+      </w:r>
+      <w:proofErr w:type="spellEnd"/>
+      <w:r>
+        <w:t>-Whyatt</w:t>
       </w:r>
       <w:r>
         <w:rPr>
@@ -9509,12 +9970,14 @@
       <w:r>
         <w:t>(VW-</w:t>
       </w:r>
+      <w:proofErr w:type="spellStart"/>
       <w:r>
         <w:rPr>
           <w:spacing w:val="-2"/>
         </w:rPr>
         <w:t>Mapshaper</w:t>
       </w:r>
+      <w:proofErr w:type="spellEnd"/>
     </w:p>
     <w:p>
       <w:pPr>
@@ -9630,7 +10093,15 @@
         <w:t>(MAPE):</w:t>
       </w:r>
       <w:r>
-        <w:t xml:space="preserve"> MAPE is used to express the error as a percentage of the original data, which gives us an insight about the errors in terms of relative size. The formula is shown in (2).</w:t>
+        <w:t xml:space="preserve"> MAPE is used to express the error as a percentage of the original data, which gives us an insight </w:t>
+      </w:r>
+      <w:proofErr w:type="gramStart"/>
+      <w:r>
+        <w:t>about</w:t>
+      </w:r>
+      <w:proofErr w:type="gramEnd"/>
+      <w:r>
+        <w:t xml:space="preserve"> the errors in terms of relative size. The formula is shown in (2).</w:t>
       </w:r>
     </w:p>
     <w:p>
@@ -9797,9 +10268,11 @@
         </w:rPr>
         <w:t xml:space="preserve"> </w:t>
       </w:r>
+      <w:proofErr w:type="gramStart"/>
       <w:r>
         <w:t>an area</w:t>
       </w:r>
+      <w:proofErr w:type="gramEnd"/>
       <w:r>
         <w:rPr>
           <w:spacing w:val="17"/>
@@ -9842,9 +10315,11 @@
         </w:rPr>
         <w:t xml:space="preserve"> </w:t>
       </w:r>
+      <w:proofErr w:type="spellStart"/>
       <w:r>
         <w:t>Mapshaper</w:t>
       </w:r>
+      <w:proofErr w:type="spellEnd"/>
       <w:r>
         <w:rPr>
           <w:spacing w:val="18"/>
@@ -10171,6 +10646,7 @@
           <w:sz w:val="12"/>
         </w:rPr>
       </w:pPr>
+      <w:proofErr w:type="gramStart"/>
       <w:r>
         <w:rPr>
           <w:rFonts w:ascii="Cambria Math" w:eastAsia="Cambria Math"/>
@@ -10180,6 +10656,7 @@
         </w:rPr>
         <w:t>0</w:t>
       </w:r>
+      <w:proofErr w:type="gramEnd"/>
       <w:r>
         <w:rPr>
           <w:rFonts w:ascii="Cambria Math" w:eastAsia="Cambria Math"/>
@@ -10586,7 +11063,21 @@
         <w:rPr>
           <w:rFonts w:ascii="Cambria Math" w:hAnsi="Cambria Math"/>
         </w:rPr>
-        <w:t>‘simplify()’</w:t>
+        <w:t>‘</w:t>
+      </w:r>
+      <w:proofErr w:type="gramStart"/>
+      <w:r>
+        <w:rPr>
+          <w:rFonts w:ascii="Cambria Math" w:hAnsi="Cambria Math"/>
+        </w:rPr>
+        <w:t>simplify(</w:t>
+      </w:r>
+      <w:proofErr w:type="gramEnd"/>
+      <w:r>
+        <w:rPr>
+          <w:rFonts w:ascii="Cambria Math" w:hAnsi="Cambria Math"/>
+        </w:rPr>
+        <w:t>)’</w:t>
       </w:r>
       <w:r>
         <w:t xml:space="preserve"> command with </w:t>
@@ -10595,7 +11086,21 @@
         <w:rPr>
           <w:rFonts w:ascii="Cambria Math" w:hAnsi="Cambria Math"/>
         </w:rPr>
-        <w:t>‘method=Visvalingam’.</w:t>
+        <w:t>‘method=</w:t>
+      </w:r>
+      <w:proofErr w:type="spellStart"/>
+      <w:r>
+        <w:rPr>
+          <w:rFonts w:ascii="Cambria Math" w:hAnsi="Cambria Math"/>
+        </w:rPr>
+        <w:t>Visvalingam</w:t>
+      </w:r>
+      <w:proofErr w:type="spellEnd"/>
+      <w:r>
+        <w:rPr>
+          <w:rFonts w:ascii="Cambria Math" w:hAnsi="Cambria Math"/>
+        </w:rPr>
+        <w:t>’.</w:t>
       </w:r>
     </w:p>
     <w:p>
@@ -11059,6 +11564,7 @@
         </w:rPr>
         <w:t>O</w:t>
       </w:r>
+      <w:proofErr w:type="spellStart"/>
       <w:r>
         <w:rPr>
           <w:i/>
@@ -11066,6 +11572,7 @@
         </w:rPr>
         <w:t>i</w:t>
       </w:r>
+      <w:proofErr w:type="spellEnd"/>
       <w:r>
         <w:rPr>
           <w:spacing w:val="6"/>
@@ -11096,6 +11603,7 @@
         </w:rPr>
         <w:t>P</w:t>
       </w:r>
+      <w:proofErr w:type="spellStart"/>
       <w:r>
         <w:rPr>
           <w:i/>
@@ -11103,6 +11611,7 @@
         </w:rPr>
         <w:t>i</w:t>
       </w:r>
+      <w:proofErr w:type="spellEnd"/>
       <w:r>
         <w:rPr>
           <w:spacing w:val="6"/>
@@ -11850,7 +12359,35 @@
         <w:rPr>
           <w:sz w:val="20"/>
         </w:rPr>
-        <w:t xml:space="preserve">represents the Shannon entropy of a distribution. It is important that this metric is minimised, since a lower score indicates that the important information between the two sets of data, that is, original and simplified is preserved, whilst reducing the data </w:t>
+        <w:t xml:space="preserve">represents the Shannon entropy of a distribution. It is important that this metric is </w:t>
+      </w:r>
+      <w:proofErr w:type="spellStart"/>
+      <w:r>
+        <w:rPr>
+          <w:sz w:val="20"/>
+        </w:rPr>
+        <w:t>minimised</w:t>
+      </w:r>
+      <w:proofErr w:type="spellEnd"/>
+      <w:r>
+        <w:rPr>
+          <w:sz w:val="20"/>
+        </w:rPr>
+        <w:t xml:space="preserve">, since a lower score indicates that the important information between the two sets of data, that is, original and </w:t>
+      </w:r>
+      <w:proofErr w:type="gramStart"/>
+      <w:r>
+        <w:rPr>
+          <w:sz w:val="20"/>
+        </w:rPr>
+        <w:t>simplified</w:t>
+      </w:r>
+      <w:proofErr w:type="gramEnd"/>
+      <w:r>
+        <w:rPr>
+          <w:sz w:val="20"/>
+        </w:rPr>
+        <w:t xml:space="preserve"> is preserved, whilst reducing the data </w:t>
       </w:r>
       <w:r>
         <w:rPr>
@@ -12059,6 +12596,7 @@
           </mc:Fallback>
         </mc:AlternateContent>
       </w:r>
+      <w:proofErr w:type="gramStart"/>
       <w:r>
         <w:rPr>
           <w:rFonts w:ascii="Cambria Math" w:eastAsia="Cambria Math" w:hAnsi="Cambria Math"/>
@@ -12079,6 +12617,7 @@
         </w:rPr>
         <w:t>(</w:t>
       </w:r>
+      <w:proofErr w:type="gramEnd"/>
       <w:r>
         <w:rPr>
           <w:rFonts w:ascii="Cambria Math" w:eastAsia="Cambria Math" w:hAnsi="Cambria Math"/>
@@ -12185,7 +12724,14 @@
         <w:rPr>
           <w:rFonts w:ascii="Cambria Math" w:eastAsia="Cambria Math" w:hAnsi="Cambria Math"/>
         </w:rPr>
-        <w:t>(𝐻</w:t>
+        <w:t>(</w:t>
+      </w:r>
+      <w:proofErr w:type="gramStart"/>
+      <w:r>
+        <w:rPr>
+          <w:rFonts w:ascii="Cambria Math" w:eastAsia="Cambria Math" w:hAnsi="Cambria Math"/>
+        </w:rPr>
+        <w:t>𝐻</w:t>
       </w:r>
       <w:r>
         <w:rPr>
@@ -12256,6 +12802,7 @@
         </w:rPr>
         <w:t>)</w:t>
       </w:r>
+      <w:proofErr w:type="gramEnd"/>
       <w:r>
         <w:rPr>
           <w:rFonts w:ascii="Cambria Math" w:eastAsia="Cambria Math" w:hAnsi="Cambria Math"/>
@@ -12600,9 +13147,11 @@
         </w:rPr>
         <w:t xml:space="preserve"> </w:t>
       </w:r>
+      <w:proofErr w:type="spellStart"/>
       <w:r>
         <w:t>GeoPython</w:t>
       </w:r>
+      <w:proofErr w:type="spellEnd"/>
       <w:r>
         <w:rPr>
           <w:spacing w:val="80"/>
@@ -12627,8 +13176,13 @@
         </w:rPr>
         <w:t xml:space="preserve"> </w:t>
       </w:r>
-      <w:r>
-        <w:t>Mapshaper framework with a tolerance of 0.1% was explored. This is due to</w:t>
+      <w:proofErr w:type="spellStart"/>
+      <w:r>
+        <w:t>Mapshaper</w:t>
+      </w:r>
+      <w:proofErr w:type="spellEnd"/>
+      <w:r>
+        <w:t xml:space="preserve"> framework with a tolerance of 0.1% was explored. This is due to</w:t>
       </w:r>
       <w:r>
         <w:rPr>
@@ -13148,8 +13702,13 @@
         <w:spacing w:before="173"/>
         <w:ind w:right="40"/>
       </w:pPr>
-      <w:r>
-        <w:t>a result, the model was able to ensure less overlapping in the simplified data and the retention of boundaries between adjacent</w:t>
+      <w:proofErr w:type="gramStart"/>
+      <w:r>
+        <w:t>a result</w:t>
+      </w:r>
+      <w:proofErr w:type="gramEnd"/>
+      <w:r>
+        <w:t>, the model was able to ensure less overlapping in the simplified data and the retention of boundaries between adjacent</w:t>
       </w:r>
       <w:r>
         <w:rPr>
@@ -13246,7 +13805,15 @@
         <w:ind w:right="38" w:firstLine="288"/>
       </w:pPr>
       <w:r>
-        <w:t xml:space="preserve">Lastly, the VW simplifier was applied using Mapshaper, which shows more details with 0.1% tolerance whilst also </w:t>
+        <w:t xml:space="preserve">Lastly, the VW simplifier was applied using </w:t>
+      </w:r>
+      <w:proofErr w:type="spellStart"/>
+      <w:r>
+        <w:t>Mapshaper</w:t>
+      </w:r>
+      <w:proofErr w:type="spellEnd"/>
+      <w:r>
+        <w:t xml:space="preserve">, which shows more details with 0.1% tolerance whilst also </w:t>
       </w:r>
       <w:r>
         <w:rPr>
@@ -13353,11 +13920,19 @@
       <w:r>
         <w:t xml:space="preserve">to the retention of boundaries between adjacent polygons </w:t>
       </w:r>
-      <w:r>
-        <w:rPr>
-          <w:spacing w:val="-2"/>
-        </w:rPr>
-        <w:t>feature,</w:t>
+      <w:proofErr w:type="gramStart"/>
+      <w:r>
+        <w:rPr>
+          <w:spacing w:val="-2"/>
+        </w:rPr>
+        <w:t>feature</w:t>
+      </w:r>
+      <w:proofErr w:type="gramEnd"/>
+      <w:r>
+        <w:rPr>
+          <w:spacing w:val="-2"/>
+        </w:rPr>
+        <w:t>,</w:t>
       </w:r>
       <w:r>
         <w:rPr>
@@ -13473,11 +14048,21 @@
         </w:rPr>
         <w:t xml:space="preserve"> </w:t>
       </w:r>
-      <w:r>
-        <w:rPr>
-          <w:spacing w:val="-2"/>
-        </w:rPr>
-        <w:t xml:space="preserve">detailed.This </w:t>
+      <w:proofErr w:type="spellStart"/>
+      <w:proofErr w:type="gramStart"/>
+      <w:r>
+        <w:rPr>
+          <w:spacing w:val="-2"/>
+        </w:rPr>
+        <w:t>detailed.This</w:t>
+      </w:r>
+      <w:proofErr w:type="spellEnd"/>
+      <w:proofErr w:type="gramEnd"/>
+      <w:r>
+        <w:rPr>
+          <w:spacing w:val="-2"/>
+        </w:rPr>
+        <w:t xml:space="preserve"> </w:t>
       </w:r>
       <w:r>
         <w:t xml:space="preserve">tolerance level determines how much the simplified lines can deviate from the original lines. The overlapping between the boundaries of the neighborhoods is a result of the tolerance applied. For a deeper understanding of the results, the number of vertices per neighborhood as well as their accuracies were </w:t>
@@ -13558,8 +14143,13 @@
         </w:rPr>
         <w:t xml:space="preserve"> </w:t>
       </w:r>
-      <w:r>
-        <w:t>geometries while</w:t>
+      <w:proofErr w:type="gramStart"/>
+      <w:r>
+        <w:t>geometries</w:t>
+      </w:r>
+      <w:proofErr w:type="gramEnd"/>
+      <w:r>
+        <w:t xml:space="preserve"> while</w:t>
       </w:r>
       <w:r>
         <w:rPr>
@@ -13621,8 +14211,13 @@
         </w:rPr>
         <w:t xml:space="preserve"> </w:t>
       </w:r>
-      <w:r>
-        <w:t>geometries.</w:t>
+      <w:proofErr w:type="gramStart"/>
+      <w:r>
+        <w:t>geometries</w:t>
+      </w:r>
+      <w:proofErr w:type="gramEnd"/>
+      <w:r>
+        <w:t>.</w:t>
       </w:r>
       <w:r>
         <w:rPr>
@@ -13640,8 +14235,13 @@
         <w:t xml:space="preserve"> </w:t>
       </w:r>
       <w:r>
-        <w:t>is evident from the graph that the original polygon of the neighborhoods has number of vertices much higher than the simplified in which for the simplified the number of vertices decrease</w:t>
-      </w:r>
+        <w:t xml:space="preserve">is evident from the graph that the original polygon of the neighborhoods has number of vertices much higher than the simplified in which for the simplified the number of vertices </w:t>
+      </w:r>
+      <w:proofErr w:type="gramStart"/>
+      <w:r>
+        <w:t>decrease</w:t>
+      </w:r>
+      <w:proofErr w:type="gramEnd"/>
       <w:r>
         <w:rPr>
           <w:spacing w:val="-8"/>
@@ -13756,8 +14356,13 @@
         </w:rPr>
         <w:t xml:space="preserve"> </w:t>
       </w:r>
-      <w:r>
-        <w:t>decrease.</w:t>
+      <w:proofErr w:type="gramStart"/>
+      <w:r>
+        <w:t>decrease</w:t>
+      </w:r>
+      <w:proofErr w:type="gramEnd"/>
+      <w:r>
+        <w:t>.</w:t>
       </w:r>
       <w:r>
         <w:rPr>
@@ -13980,7 +14585,15 @@
         <w:t xml:space="preserve"> </w:t>
       </w:r>
       <w:r>
-        <w:t>spatial join and the number of vertices produced after line simplification</w:t>
+        <w:t xml:space="preserve">spatial </w:t>
+      </w:r>
+      <w:proofErr w:type="gramStart"/>
+      <w:r>
+        <w:t>join</w:t>
+      </w:r>
+      <w:proofErr w:type="gramEnd"/>
+      <w:r>
+        <w:t xml:space="preserve"> and the number of vertices produced after line simplification</w:t>
       </w:r>
       <w:r>
         <w:rPr>
@@ -14307,8 +14920,13 @@
         </w:rPr>
         <w:t xml:space="preserve"> </w:t>
       </w:r>
-      <w:r>
-        <w:t>join,</w:t>
+      <w:proofErr w:type="gramStart"/>
+      <w:r>
+        <w:t>join</w:t>
+      </w:r>
+      <w:proofErr w:type="gramEnd"/>
+      <w:r>
+        <w:t>,</w:t>
       </w:r>
       <w:r>
         <w:rPr>
@@ -14613,9 +15231,11 @@
         </w:rPr>
         <w:t xml:space="preserve"> </w:t>
       </w:r>
+      <w:proofErr w:type="gramStart"/>
       <w:r>
         <w:t>join</w:t>
       </w:r>
+      <w:proofErr w:type="gramEnd"/>
       <w:r>
         <w:rPr>
           <w:spacing w:val="11"/>
@@ -15077,8 +15697,13 @@
         </w:rPr>
         <w:t xml:space="preserve"> </w:t>
       </w:r>
-      <w:r>
-        <w:t>join,</w:t>
+      <w:proofErr w:type="gramStart"/>
+      <w:r>
+        <w:t>join</w:t>
+      </w:r>
+      <w:proofErr w:type="gramEnd"/>
+      <w:r>
+        <w:t>,</w:t>
       </w:r>
       <w:r>
         <w:rPr>
@@ -15177,8 +15802,13 @@
         <w:t xml:space="preserve"> </w:t>
       </w:r>
       <w:r>
-        <w:t>the join</w:t>
-      </w:r>
+        <w:t xml:space="preserve">the </w:t>
+      </w:r>
+      <w:proofErr w:type="gramStart"/>
+      <w:r>
+        <w:t>join</w:t>
+      </w:r>
+      <w:proofErr w:type="gramEnd"/>
       <w:r>
         <w:rPr>
           <w:spacing w:val="-2"/>
@@ -15249,7 +15879,15 @@
         <w:t xml:space="preserve"> </w:t>
       </w:r>
       <w:r>
-        <w:t>of spatial joins between the two sets of geographical data, where the neighborhood and air quality data is evaluated to see how simplification affects the joins.</w:t>
+        <w:t xml:space="preserve">of spatial joins between the two sets of geographical data, where the neighborhood and air quality data </w:t>
+      </w:r>
+      <w:proofErr w:type="gramStart"/>
+      <w:r>
+        <w:t>is</w:t>
+      </w:r>
+      <w:proofErr w:type="gramEnd"/>
+      <w:r>
+        <w:t xml:space="preserve"> evaluated to see how simplification affects the joins.</w:t>
       </w:r>
     </w:p>
     <w:p>
@@ -15285,6 +15923,7 @@
         </w:rPr>
         <w:t xml:space="preserve"> </w:t>
       </w:r>
+      <w:proofErr w:type="gramStart"/>
       <w:r>
         <w:t>are</w:t>
       </w:r>
@@ -15297,6 +15936,7 @@
       <w:r>
         <w:t>ranging</w:t>
       </w:r>
+      <w:proofErr w:type="gramEnd"/>
       <w:r>
         <w:rPr>
           <w:spacing w:val="-10"/>
@@ -15340,7 +15980,15 @@
         <w:t xml:space="preserve"> </w:t>
       </w:r>
       <w:r>
-        <w:t>with an increment 0.001. The tolerance value determines how the vertices</w:t>
+        <w:t xml:space="preserve">with an </w:t>
+      </w:r>
+      <w:proofErr w:type="gramStart"/>
+      <w:r>
+        <w:t>increment</w:t>
+      </w:r>
+      <w:proofErr w:type="gramEnd"/>
+      <w:r>
+        <w:t xml:space="preserve"> 0.001. The tolerance value determines how the vertices</w:t>
       </w:r>
       <w:r>
         <w:rPr>
@@ -15430,7 +16078,17 @@
         <w:t xml:space="preserve"> </w:t>
       </w:r>
       <w:r>
-        <w:t xml:space="preserve">the graph,the accuracy decreases with increasing tolerance, indicating that there is a tradeoff between reducing the complexity of the data via simplification and maintaining the accuracy. It can also be seen from the graph that there is a </w:t>
+        <w:t xml:space="preserve">the </w:t>
+      </w:r>
+      <w:proofErr w:type="spellStart"/>
+      <w:proofErr w:type="gramStart"/>
+      <w:r>
+        <w:t>graph,the</w:t>
+      </w:r>
+      <w:proofErr w:type="spellEnd"/>
+      <w:proofErr w:type="gramEnd"/>
+      <w:r>
+        <w:t xml:space="preserve"> accuracy decreases with increasing tolerance, indicating that there is a tradeoff between reducing the complexity of the data via simplification and maintaining the accuracy. It can also be seen from the graph that there is a </w:t>
       </w:r>
       <w:r>
         <w:rPr>
@@ -15556,7 +16214,15 @@
         <w:t xml:space="preserve"> </w:t>
       </w:r>
       <w:r>
-        <w:t>for the joins are being removed. This graph</w:t>
+        <w:t xml:space="preserve">for the </w:t>
+      </w:r>
+      <w:proofErr w:type="gramStart"/>
+      <w:r>
+        <w:t>joins</w:t>
+      </w:r>
+      <w:proofErr w:type="gramEnd"/>
+      <w:r>
+        <w:t xml:space="preserve"> are being removed. This graph</w:t>
       </w:r>
       <w:r>
         <w:rPr>
@@ -15843,9 +16509,11 @@
         </w:rPr>
         <w:t xml:space="preserve"> </w:t>
       </w:r>
+      <w:proofErr w:type="gramStart"/>
       <w:r>
         <w:t>much</w:t>
       </w:r>
+      <w:proofErr w:type="gramEnd"/>
       <w:r>
         <w:rPr>
           <w:spacing w:val="-7"/>
@@ -16104,9 +16772,11 @@
         </w:rPr>
         <w:t xml:space="preserve"> </w:t>
       </w:r>
+      <w:proofErr w:type="spellStart"/>
       <w:r>
         <w:t>Mapshaper</w:t>
       </w:r>
+      <w:proofErr w:type="spellEnd"/>
       <w:r>
         <w:rPr>
           <w:spacing w:val="-7"/>
@@ -16131,9 +16801,11 @@
         </w:rPr>
         <w:t xml:space="preserve"> </w:t>
       </w:r>
+      <w:proofErr w:type="spellStart"/>
       <w:r>
         <w:t>Mapshaper</w:t>
       </w:r>
+      <w:proofErr w:type="spellEnd"/>
       <w:r>
         <w:rPr>
           <w:spacing w:val="-9"/>
@@ -16275,9 +16947,11 @@
         </w:rPr>
         <w:t xml:space="preserve"> </w:t>
       </w:r>
+      <w:proofErr w:type="spellStart"/>
       <w:r>
         <w:t>Mapshaper</w:t>
       </w:r>
+      <w:proofErr w:type="spellEnd"/>
       <w:r>
         <w:rPr>
           <w:spacing w:val="-6"/>
@@ -16686,12 +17360,14 @@
       <w:r>
         <w:t xml:space="preserve">the two algorithms, making them both effective. MAPE is minimized with a low score of 0.048 and 0.049 for DP- </w:t>
       </w:r>
+      <w:proofErr w:type="spellStart"/>
       <w:r>
         <w:rPr>
           <w:spacing w:val="-2"/>
         </w:rPr>
         <w:t>Mapshaper</w:t>
       </w:r>
+      <w:proofErr w:type="spellEnd"/>
       <w:r>
         <w:rPr>
           <w:spacing w:val="-6"/>
@@ -16714,7 +17390,21 @@
         <w:rPr>
           <w:spacing w:val="-2"/>
         </w:rPr>
-        <w:t>VW-Mapshaper,</w:t>
+        <w:t>VW-</w:t>
+      </w:r>
+      <w:proofErr w:type="spellStart"/>
+      <w:r>
+        <w:rPr>
+          <w:spacing w:val="-2"/>
+        </w:rPr>
+        <w:t>Mapshaper</w:t>
+      </w:r>
+      <w:proofErr w:type="spellEnd"/>
+      <w:r>
+        <w:rPr>
+          <w:spacing w:val="-2"/>
+        </w:rPr>
+        <w:t>,</w:t>
       </w:r>
       <w:r>
         <w:rPr>
@@ -18445,7 +19135,23 @@
         <w:t xml:space="preserve"> </w:t>
       </w:r>
       <w:r>
-        <w:t>line simplification algorithms namely Douglas-Peucker and Visvalingam-Whyatt. Two different tools – Shapely and Map shaper were used to compare DP while only Map shaper was used for the VW. It was evident from the results that both algorithms performed in a similar manner via the Map shaper interface,</w:t>
+        <w:t>line simplification algorithms namely Douglas-</w:t>
+      </w:r>
+      <w:proofErr w:type="spellStart"/>
+      <w:r>
+        <w:t>Peucker</w:t>
+      </w:r>
+      <w:proofErr w:type="spellEnd"/>
+      <w:r>
+        <w:t xml:space="preserve"> and </w:t>
+      </w:r>
+      <w:proofErr w:type="spellStart"/>
+      <w:r>
+        <w:t>Visvalingam</w:t>
+      </w:r>
+      <w:proofErr w:type="spellEnd"/>
+      <w:r>
+        <w:t>-Whyatt. Two different tools – Shapely and Map shaper were used to compare DP while only Map shaper was used for the VW. It was evident from the results that both algorithms performed in a similar manner via the Map shaper interface,</w:t>
       </w:r>
       <w:r>
         <w:rPr>
@@ -18606,8 +19312,29 @@
         </w:rPr>
         <w:t xml:space="preserve"> </w:t>
       </w:r>
-      <w:r>
-        <w:t>joins increases, seeing as it is computationally expensive in its full form. This approach allows the data size to be significantly reduced whilst preserving the geometric characteristics of the data</w:t>
+      <w:proofErr w:type="gramStart"/>
+      <w:r>
+        <w:t>joins</w:t>
+      </w:r>
+      <w:proofErr w:type="gramEnd"/>
+      <w:r>
+        <w:t xml:space="preserve"> increases, seeing as </w:t>
+      </w:r>
+      <w:proofErr w:type="gramStart"/>
+      <w:r>
+        <w:t>it is</w:t>
+      </w:r>
+      <w:proofErr w:type="gramEnd"/>
+      <w:r>
+        <w:t xml:space="preserve"> computationally expensive in </w:t>
+      </w:r>
+      <w:proofErr w:type="gramStart"/>
+      <w:r>
+        <w:t>its</w:t>
+      </w:r>
+      <w:proofErr w:type="gramEnd"/>
+      <w:r>
+        <w:t xml:space="preserve"> full form. This approach allows the data size to be significantly reduced whilst preserving the geometric characteristics of the data</w:t>
       </w:r>
       <w:r>
         <w:rPr>
@@ -18866,7 +19593,15 @@
         <w:t xml:space="preserve"> </w:t>
       </w:r>
       <w:r>
-        <w:t>Noise), clustering, and regression; allowing analysts to make more informed, strategic decisions</w:t>
+        <w:t xml:space="preserve">Noise), clustering, and </w:t>
+      </w:r>
+      <w:proofErr w:type="gramStart"/>
+      <w:r>
+        <w:t>regression;</w:t>
+      </w:r>
+      <w:proofErr w:type="gramEnd"/>
+      <w:r>
+        <w:t xml:space="preserve"> allowing analysts to make more informed, strategic decisions</w:t>
       </w:r>
       <w:r>
         <w:rPr>
@@ -18911,7 +19646,21 @@
         <w:rPr>
           <w:sz w:val="16"/>
         </w:rPr>
-        <w:t>D. H. Douglas and T. K. Peucker, "Algorithms for the reduction of the</w:t>
+        <w:t xml:space="preserve">D. H. Douglas and T. K. </w:t>
+      </w:r>
+      <w:proofErr w:type="spellStart"/>
+      <w:r>
+        <w:rPr>
+          <w:sz w:val="16"/>
+        </w:rPr>
+        <w:t>Peucker</w:t>
+      </w:r>
+      <w:proofErr w:type="spellEnd"/>
+      <w:r>
+        <w:rPr>
+          <w:sz w:val="16"/>
+        </w:rPr>
+        <w:t>, "Algorithms for the reduction of the</w:t>
       </w:r>
       <w:r>
         <w:rPr>
@@ -18933,12 +19682,21 @@
         </w:rPr>
         <w:t xml:space="preserve"> </w:t>
       </w:r>
+      <w:proofErr w:type="spellStart"/>
       <w:r>
         <w:rPr>
           <w:i/>
           <w:sz w:val="16"/>
         </w:rPr>
-        <w:t>Cartographica:</w:t>
+        <w:t>Cartographica</w:t>
+      </w:r>
+      <w:proofErr w:type="spellEnd"/>
+      <w:r>
+        <w:rPr>
+          <w:i/>
+          <w:sz w:val="16"/>
+        </w:rPr>
+        <w:t>:</w:t>
       </w:r>
       <w:r>
         <w:rPr>
@@ -19045,12 +19803,21 @@
         </w:rPr>
         <w:t xml:space="preserve"> </w:t>
       </w:r>
+      <w:proofErr w:type="spellStart"/>
       <w:r>
         <w:rPr>
           <w:i/>
           <w:sz w:val="16"/>
         </w:rPr>
-        <w:t>geovisualization,</w:t>
+        <w:t>geovisualization</w:t>
+      </w:r>
+      <w:proofErr w:type="spellEnd"/>
+      <w:r>
+        <w:rPr>
+          <w:i/>
+          <w:sz w:val="16"/>
+        </w:rPr>
+        <w:t>,</w:t>
       </w:r>
       <w:r>
         <w:rPr>
@@ -19080,7 +19847,21 @@
         <w:rPr>
           <w:sz w:val="16"/>
         </w:rPr>
-        <w:t>M. Visvalingam and J. D. Whyatt, "Line generalization by repeated</w:t>
+        <w:t xml:space="preserve">M. </w:t>
+      </w:r>
+      <w:proofErr w:type="spellStart"/>
+      <w:r>
+        <w:rPr>
+          <w:sz w:val="16"/>
+        </w:rPr>
+        <w:t>Visvalingam</w:t>
+      </w:r>
+      <w:proofErr w:type="spellEnd"/>
+      <w:r>
+        <w:rPr>
+          <w:sz w:val="16"/>
+        </w:rPr>
+        <w:t xml:space="preserve"> and J. D. Whyatt, "Line generalization by repeated</w:t>
       </w:r>
       <w:r>
         <w:rPr>
@@ -19235,7 +20016,21 @@
         <w:rPr>
           <w:sz w:val="16"/>
         </w:rPr>
-        <w:t>"MapShaper.</w:t>
+        <w:t>"</w:t>
+      </w:r>
+      <w:proofErr w:type="spellStart"/>
+      <w:r>
+        <w:rPr>
+          <w:sz w:val="16"/>
+        </w:rPr>
+        <w:t>MapShaper</w:t>
+      </w:r>
+      <w:proofErr w:type="spellEnd"/>
+      <w:r>
+        <w:rPr>
+          <w:sz w:val="16"/>
+        </w:rPr>
+        <w:t>.</w:t>
       </w:r>
       <w:r>
         <w:rPr>
@@ -19463,11 +20258,19 @@
         </w:rPr>
         <w:t xml:space="preserve"> </w:t>
       </w:r>
-      <w:r>
-        <w:rPr>
-          <w:sz w:val="16"/>
-        </w:rPr>
-        <w:t>Jawarneh,</w:t>
+      <w:proofErr w:type="spellStart"/>
+      <w:r>
+        <w:rPr>
+          <w:sz w:val="16"/>
+        </w:rPr>
+        <w:t>Jawarneh</w:t>
+      </w:r>
+      <w:proofErr w:type="spellEnd"/>
+      <w:r>
+        <w:rPr>
+          <w:sz w:val="16"/>
+        </w:rPr>
+        <w:t>,</w:t>
       </w:r>
       <w:r>
         <w:rPr>
@@ -19615,7 +20418,21 @@
         <w:rPr>
           <w:sz w:val="16"/>
         </w:rPr>
-        <w:t>I. M. Al Jawarneh, R. Montanari, and A. Corradi, "Cost-Effective</w:t>
+        <w:t xml:space="preserve">I. M. Al </w:t>
+      </w:r>
+      <w:proofErr w:type="spellStart"/>
+      <w:r>
+        <w:rPr>
+          <w:sz w:val="16"/>
+        </w:rPr>
+        <w:t>Jawarneh</w:t>
+      </w:r>
+      <w:proofErr w:type="spellEnd"/>
+      <w:r>
+        <w:rPr>
+          <w:sz w:val="16"/>
+        </w:rPr>
+        <w:t>, R. Montanari, and A. Corradi, "Cost-Effective</w:t>
       </w:r>
       <w:r>
         <w:rPr>
@@ -19657,6 +20474,7 @@
         </w:rPr>
         <w:t xml:space="preserve"> </w:t>
       </w:r>
+      <w:proofErr w:type="spellStart"/>
       <w:r>
         <w:rPr>
           <w:i/>
@@ -19664,6 +20482,7 @@
         </w:rPr>
         <w:t>Globecom</w:t>
       </w:r>
+      <w:proofErr w:type="spellEnd"/>
       <w:r>
         <w:rPr>
           <w:sz w:val="16"/>
@@ -19696,12 +20515,21 @@
         </w:rPr>
         <w:t xml:space="preserve"> </w:t>
       </w:r>
+      <w:proofErr w:type="spellStart"/>
       <w:r>
         <w:rPr>
           <w:i/>
           <w:sz w:val="16"/>
         </w:rPr>
-        <w:t>Wkshps)</w:t>
+        <w:t>Wkshps</w:t>
+      </w:r>
+      <w:proofErr w:type="spellEnd"/>
+      <w:r>
+        <w:rPr>
+          <w:i/>
+          <w:sz w:val="16"/>
+        </w:rPr>
+        <w:t>)</w:t>
       </w:r>
       <w:r>
         <w:rPr>
@@ -19941,7 +20769,21 @@
         <w:rPr>
           <w:sz w:val="16"/>
         </w:rPr>
-        <w:t>. Packt Publishing Ltd, 2019.</w:t>
+        <w:t xml:space="preserve">. </w:t>
+      </w:r>
+      <w:proofErr w:type="spellStart"/>
+      <w:r>
+        <w:rPr>
+          <w:sz w:val="16"/>
+        </w:rPr>
+        <w:t>Packt</w:t>
+      </w:r>
+      <w:proofErr w:type="spellEnd"/>
+      <w:r>
+        <w:rPr>
+          <w:sz w:val="16"/>
+        </w:rPr>
+        <w:t xml:space="preserve"> Publishing Ltd, 2019.</w:t>
       </w:r>
     </w:p>
     <w:p>
@@ -19965,7 +20807,21 @@
         <w:rPr>
           <w:sz w:val="16"/>
         </w:rPr>
-        <w:t>I. M. Al Jawarneh, P. Bellavista, A. Corradi, L. Foschini, and R.</w:t>
+        <w:t xml:space="preserve">I. M. Al </w:t>
+      </w:r>
+      <w:proofErr w:type="spellStart"/>
+      <w:r>
+        <w:rPr>
+          <w:sz w:val="16"/>
+        </w:rPr>
+        <w:t>Jawarneh</w:t>
+      </w:r>
+      <w:proofErr w:type="spellEnd"/>
+      <w:r>
+        <w:rPr>
+          <w:sz w:val="16"/>
+        </w:rPr>
+        <w:t>, P. Bellavista, A. Corradi, L. Foschini, and R.</w:t>
       </w:r>
       <w:r>
         <w:rPr>
@@ -19978,7 +20834,21 @@
         <w:rPr>
           <w:sz w:val="16"/>
         </w:rPr>
-        <w:t>Montanari, "SpatialSSJP: QoS-Aware Adaptive Approximate Stream-</w:t>
+        <w:t>Montanari, "</w:t>
+      </w:r>
+      <w:proofErr w:type="spellStart"/>
+      <w:r>
+        <w:rPr>
+          <w:sz w:val="16"/>
+        </w:rPr>
+        <w:t>SpatialSSJP</w:t>
+      </w:r>
+      <w:proofErr w:type="spellEnd"/>
+      <w:r>
+        <w:rPr>
+          <w:sz w:val="16"/>
+        </w:rPr>
+        <w:t>: QoS-Aware Adaptive Approximate Stream-</w:t>
       </w:r>
       <w:r>
         <w:rPr>
@@ -20326,7 +21196,21 @@
         <w:rPr>
           <w:sz w:val="16"/>
         </w:rPr>
-        <w:t>I. M. Al Jawarneh, L. Foschini,</w:t>
+        <w:t xml:space="preserve">I. M. Al </w:t>
+      </w:r>
+      <w:proofErr w:type="spellStart"/>
+      <w:r>
+        <w:rPr>
+          <w:sz w:val="16"/>
+        </w:rPr>
+        <w:t>Jawarneh</w:t>
+      </w:r>
+      <w:proofErr w:type="spellEnd"/>
+      <w:r>
+        <w:rPr>
+          <w:sz w:val="16"/>
+        </w:rPr>
+        <w:t>, L. Foschini,</w:t>
       </w:r>
       <w:r>
         <w:rPr>
@@ -20631,7 +21515,21 @@
         <w:rPr>
           <w:sz w:val="16"/>
         </w:rPr>
-        <w:t>I. M. Al Jawarneh, L. Foschini, and P. Bellavista, "Efficient Integration</w:t>
+        <w:t xml:space="preserve">I. M. Al </w:t>
+      </w:r>
+      <w:proofErr w:type="spellStart"/>
+      <w:r>
+        <w:rPr>
+          <w:sz w:val="16"/>
+        </w:rPr>
+        <w:t>Jawarneh</w:t>
+      </w:r>
+      <w:proofErr w:type="spellEnd"/>
+      <w:r>
+        <w:rPr>
+          <w:sz w:val="16"/>
+        </w:rPr>
+        <w:t>, L. Foschini, and P. Bellavista, "Efficient Integration</w:t>
       </w:r>
       <w:r>
         <w:rPr>
@@ -20824,7 +21722,21 @@
         <w:rPr>
           <w:sz w:val="16"/>
         </w:rPr>
-        <w:t>I. M. Al Jawarneh, P. Bellavista, A. Corradi, L. Foschini, and R.</w:t>
+        <w:t xml:space="preserve">I. M. Al </w:t>
+      </w:r>
+      <w:proofErr w:type="spellStart"/>
+      <w:r>
+        <w:rPr>
+          <w:sz w:val="16"/>
+        </w:rPr>
+        <w:t>Jawarneh</w:t>
+      </w:r>
+      <w:proofErr w:type="spellEnd"/>
+      <w:r>
+        <w:rPr>
+          <w:sz w:val="16"/>
+        </w:rPr>
+        <w:t>, P. Bellavista, A. Corradi, L. Foschini, and R.</w:t>
       </w:r>
       <w:r>
         <w:rPr>
@@ -21736,11 +22648,19 @@
           <w:sz w:val="16"/>
         </w:rPr>
       </w:pPr>
-      <w:r>
-        <w:rPr>
-          <w:sz w:val="16"/>
-        </w:rPr>
-        <w:t>pp.</w:t>
+      <w:proofErr w:type="gramStart"/>
+      <w:r>
+        <w:rPr>
+          <w:sz w:val="16"/>
+        </w:rPr>
+        <w:t>pp</w:t>
+      </w:r>
+      <w:proofErr w:type="gramEnd"/>
+      <w:r>
+        <w:rPr>
+          <w:sz w:val="16"/>
+        </w:rPr>
+        <w:t>.</w:t>
       </w:r>
       <w:r>
         <w:rPr>
@@ -21941,7 +22861,21 @@
         <w:rPr>
           <w:sz w:val="16"/>
         </w:rPr>
-        <w:t>K. Reumann and A. Witkam, "Optimizing Curve Segmentation in</w:t>
+        <w:t xml:space="preserve">K. Reumann and A. </w:t>
+      </w:r>
+      <w:proofErr w:type="spellStart"/>
+      <w:r>
+        <w:rPr>
+          <w:sz w:val="16"/>
+        </w:rPr>
+        <w:t>Witkam</w:t>
+      </w:r>
+      <w:proofErr w:type="spellEnd"/>
+      <w:r>
+        <w:rPr>
+          <w:sz w:val="16"/>
+        </w:rPr>
+        <w:t>, "Optimizing Curve Segmentation in</w:t>
       </w:r>
       <w:r>
         <w:rPr>
@@ -23409,6 +24343,7 @@
   <w:style w:type="character" w:default="1" w:styleId="DefaultParagraphFont">
     <w:name w:val="Default Paragraph Font"/>
     <w:uiPriority w:val="1"/>
+    <w:semiHidden/>
     <w:unhideWhenUsed/>
   </w:style>
   <w:style w:type="table" w:default="1" w:styleId="TableNormal">

</xml_diff>